<commit_message>
Remove obvious reading-mode narration from v13 and presenter guide
</commit_message>
<xml_diff>
--- a/submission/PathwayAI_v13.docx
+++ b/submission/PathwayAI_v13.docx
@@ -35,11 +35,6 @@
     <w:p>
       <w:r>
         <w:t>Let’s look at how it works.</w:t>
-      </w:r>
-    </w:p>
-    <w:p>
-      <w:r>
-        <w:t>Choose the situation that fits you. Use “Quick and easy” for shorter steps.</w:t>
       </w:r>
     </w:p>
     <w:p>

</xml_diff>